<commit_message>
Restore Figma and shared component guide report links
</commit_message>
<xml_diff>
--- a/p9/P9_Team08_Report_Draft.docx
+++ b/p9/P9_Team08_Report_Draft.docx
@@ -39,7 +39,6 @@
         <w:r>
           <w:rPr>
             <w:color w:val="174A81"/>
-            <w:u w:val="single"/>
             <w:rStyle w:val="Hyperlink"/>
           </w:rPr>
           <w:t>GitLab repository</w:t>
@@ -52,7 +51,6 @@
         <w:r>
           <w:rPr>
             <w:color w:val="174A81"/>
-            <w:u w:val="single"/>
             <w:rStyle w:val="Hyperlink"/>
           </w:rPr>
           <w:t>P9 milestone</w:t>
@@ -65,7 +63,6 @@
         <w:r>
           <w:rPr>
             <w:color w:val="174A81"/>
-            <w:u w:val="single"/>
             <w:rStyle w:val="Hyperlink"/>
           </w:rPr>
           <w:t>Updated Figma design</w:t>
@@ -3264,7 +3261,6 @@
         <w:r>
           <w:rPr>
             <w:color w:val="174A81"/>
-            <w:u w:val="single"/>
             <w:rStyle w:val="Hyperlink"/>
           </w:rPr>
           <w:t>Approved and merged MR 4</w:t>
@@ -3277,7 +3273,6 @@
         <w:r>
           <w:rPr>
             <w:color w:val="174A81"/>
-            <w:u w:val="single"/>
             <w:rStyle w:val="Hyperlink"/>
           </w:rPr>
           <w:t>Linked screen issue 25</w:t>
@@ -3996,7 +3991,6 @@
         <w:r>
           <w:rPr>
             <w:color w:val="174A81"/>
-            <w:u w:val="single"/>
             <w:rStyle w:val="Hyperlink"/>
           </w:rPr>
           <w:t>Course instructions</w:t>
@@ -4009,7 +4003,6 @@
         <w:r>
           <w:rPr>
             <w:color w:val="174A81"/>
-            <w:u w:val="single"/>
             <w:rStyle w:val="Hyperlink"/>
           </w:rPr>
           <w:t>Project README</w:t>
@@ -4022,7 +4015,6 @@
         <w:r>
           <w:rPr>
             <w:color w:val="174A81"/>
-            <w:u w:val="single"/>
             <w:rStyle w:val="Hyperlink"/>
           </w:rPr>
           <w:t>P9 tracker</w:t>
@@ -4034,7 +4026,6 @@
         <w:r>
           <w:rPr>
             <w:color w:val="174A81"/>
-            <w:u w:val="single"/>
             <w:rStyle w:val="Hyperlink"/>
           </w:rPr>
           <w:t>P8 findings</w:t>
@@ -4047,7 +4038,6 @@
         <w:r>
           <w:rPr>
             <w:color w:val="174A81"/>
-            <w:u w:val="single"/>
             <w:rStyle w:val="Hyperlink"/>
           </w:rPr>
           <w:t>Revised screens PDF</w:t>
@@ -4056,19 +4046,21 @@
       <w:r>
         <w:t xml:space="preserve">  |  </w:t>
       </w:r>
-      <w:r>
-        <w:rPr>
-          <w:u w:val="single"/>
-        </w:rPr>
-        <w:t>Figma design</w:t>
-      </w:r>
+      <w:hyperlink r:id="rId13" w:history="1">
+        <w:r>
+          <w:rPr>
+            <w:u w:val="single"/>
+            <w:color w:val="174A81"/>
+          </w:rPr>
+          <w:t>Figma design</w:t>
+        </w:r>
+      </w:hyperlink>
     </w:p>
     <w:p>
       <w:hyperlink w:history="1" r:id="rId26">
         <w:r>
           <w:rPr>
             <w:color w:val="174A81"/>
-            <w:u w:val="single"/>
             <w:rStyle w:val="Hyperlink"/>
           </w:rPr>
           <w:t>API contract</w:t>
@@ -4077,12 +4069,11 @@
       <w:r>
         <w:t xml:space="preserve">  |  </w:t>
       </w:r>
-      <w:hyperlink w:history="1" r:id="rId27">
+      <w:hyperlink r:id="rId27" w:history="1">
         <w:r>
           <w:rPr>
+            <w:u w:val="single"/>
             <w:color w:val="174A81"/>
-            <w:u w:val="single"/>
-            <w:rStyle w:val="Hyperlink"/>
           </w:rPr>
           <w:t>Shared component guide</w:t>
         </w:r>
@@ -4094,7 +4085,6 @@
         <w:r>
           <w:rPr>
             <w:color w:val="174A81"/>
-            <w:u w:val="single"/>
             <w:rStyle w:val="Hyperlink"/>
           </w:rPr>
           <w:t>GitHub file mirror</w:t>

</xml_diff>